<commit_message>
Checked in modified technical documents
</commit_message>
<xml_diff>
--- a/Documentation/AI Prompts/Lovable Prompts/Modules/Core HR/Core HR module Prompts.docx
+++ b/Documentation/AI Prompts/Lovable Prompts/Modules/Core HR/Core HR module Prompts.docx
@@ -9173,18 +9173,7 @@
           <w:lang w:val="en-GB" w:eastAsia="en-US"/>
           <w14:ligatures w14:val="standardContextual"/>
         </w:rPr>
-        <w:t xml:space="preserve"> </w:t>
-      </w:r>
-      <w:r>
-        <w:rPr>
-          <w:rFonts w:eastAsiaTheme="minorHAnsi"/>
-          <w:kern w:val="2"/>
-          <w:sz w:val="22"/>
-          <w:szCs w:val="22"/>
-          <w:lang w:val="en-GB" w:eastAsia="en-US"/>
-          <w14:ligatures w14:val="standardContextual"/>
-        </w:rPr>
-        <w:t xml:space="preserve">must not specify different base class. </w:t>
+        <w:t xml:space="preserve"> must not specify different base class. </w:t>
       </w:r>
     </w:p>
     <w:p>
@@ -9842,21 +9831,7 @@
         <w:rPr>
           <w:lang w:val="en-GB"/>
         </w:rPr>
-        <w:t xml:space="preserve"> &gt; </w:t>
-      </w:r>
-      <w:proofErr w:type="spellStart"/>
-      <w:r>
-        <w:rPr>
-          <w:lang w:val="en-GB"/>
-        </w:rPr>
-        <w:t>MaxBytes</w:t>
-      </w:r>
-      <w:proofErr w:type="spellEnd"/>
-      <w:r>
-        <w:rPr>
-          <w:lang w:val="en-GB"/>
-        </w:rPr>
-        <w:t>)</w:t>
+        <w:t xml:space="preserve"> &gt; MaxBytes)</w:t>
       </w:r>
     </w:p>
     <w:p>
@@ -31675,14 +31650,9 @@
       <w:r>
         <w:t xml:space="preserve">value =&gt; </w:t>
       </w:r>
-      <w:proofErr w:type="spellStart"/>
-      <w:proofErr w:type="gramStart"/>
-      <w:r>
-        <w:t>ToggleColumn</w:t>
-      </w:r>
-      <w:proofErr w:type="spellEnd"/>
-      <w:r>
-        <w:t>(</w:t>
+      <w:proofErr w:type="gramStart"/>
+      <w:r>
+        <w:t>ToggleColumn(</w:t>
       </w:r>
       <w:proofErr w:type="gramEnd"/>
       <w:r>
@@ -37340,37 +37310,7 @@
           <w:lang w:val="en-GB" w:eastAsia="en-US"/>
           <w14:ligatures w14:val="standardContextual"/>
         </w:rPr>
-        <w:t>Program</w:t>
-      </w:r>
-      <w:r>
-        <w:rPr>
-          <w:rFonts w:eastAsiaTheme="minorHAnsi"/>
-          <w:b/>
-          <w:bCs/>
-          <w:color w:val="215E99" w:themeColor="text2" w:themeTint="BF"/>
-          <w:kern w:val="2"/>
-          <w:sz w:val="22"/>
-          <w:szCs w:val="22"/>
-          <w:u w:val="single"/>
-          <w:lang w:val="en-GB" w:eastAsia="en-US"/>
-          <w14:ligatures w14:val="standardContextual"/>
-        </w:rPr>
-        <w:t>.</w:t>
-      </w:r>
-      <w:r>
-        <w:rPr>
-          <w:rFonts w:eastAsiaTheme="minorHAnsi"/>
-          <w:b/>
-          <w:bCs/>
-          <w:color w:val="215E99" w:themeColor="text2" w:themeTint="BF"/>
-          <w:kern w:val="2"/>
-          <w:sz w:val="22"/>
-          <w:szCs w:val="22"/>
-          <w:u w:val="single"/>
-          <w:lang w:val="en-GB" w:eastAsia="en-US"/>
-          <w14:ligatures w14:val="standardContextual"/>
-        </w:rPr>
-        <w:t>cs</w:t>
+        <w:t>Program.cs</w:t>
       </w:r>
       <w:proofErr w:type="spellEnd"/>
       <w:r>
@@ -41966,10 +41906,7 @@
     </w:p>
     <w:p>
       <w:r>
-        <w:t xml:space="preserve">I </w:t>
-      </w:r>
-      <w:r>
-        <w:t xml:space="preserve">completed the previous </w:t>
+        <w:t xml:space="preserve">I completed the previous </w:t>
       </w:r>
       <w:proofErr w:type="gramStart"/>
       <w:r>
@@ -42038,6 +41975,2099 @@
     <w:p>
       <w:r>
         <w:t>Provide production-ready fix to resolve this issue</w:t>
+      </w:r>
+    </w:p>
+    <w:p/>
+    <w:p>
+      <w:pPr>
+        <w:rPr>
+          <w:b/>
+          <w:bCs/>
+          <w:color w:val="EE0000"/>
+          <w:u w:val="single"/>
+        </w:rPr>
+      </w:pPr>
+      <w:r>
+        <w:rPr>
+          <w:b/>
+          <w:bCs/>
+          <w:color w:val="EE0000"/>
+          <w:u w:val="single"/>
+        </w:rPr>
+        <w:t>Prompt #13:</w:t>
+      </w:r>
+    </w:p>
+    <w:p>
+      <w:r>
+        <w:t xml:space="preserve">Below is the razor code for the Dashboard – Overview page. Refactor the code to enhance the design and </w:t>
+      </w:r>
+      <w:r>
+        <w:t>layout.</w:t>
+      </w:r>
+      <w:r>
+        <w:t xml:space="preserve"> </w:t>
+      </w:r>
+      <w:r>
+        <w:t>Use a calm, wellness-inspired design. Soft gradients, muted earth tones, round corners, and generous padding. Font is "</w:t>
+      </w:r>
+      <w:proofErr w:type="gramStart"/>
+      <w:r>
+        <w:t>Inter</w:t>
+      </w:r>
+      <w:proofErr w:type="gramEnd"/>
+      <w:r>
+        <w:t>". Overall tone should feel gentle and reassuring.</w:t>
+      </w:r>
+      <w:r>
+        <w:t xml:space="preserve"> </w:t>
+      </w:r>
+    </w:p>
+    <w:p>
+      <w:r>
+        <w:t xml:space="preserve">Below is the razor code for the Dashboard – Overview page. Refactor the code to enhance the design and layout. </w:t>
+      </w:r>
+      <w:r>
+        <w:t>Use a calm, wellness-inspired design. Soft gradients, muted earth tones, round corners, and generous padding. Font is "</w:t>
+      </w:r>
+      <w:proofErr w:type="gramStart"/>
+      <w:r>
+        <w:t>Inter</w:t>
+      </w:r>
+      <w:proofErr w:type="gramEnd"/>
+      <w:r>
+        <w:t xml:space="preserve">". Overall tone should </w:t>
+      </w:r>
+      <w:r>
+        <w:t>f</w:t>
+      </w:r>
+      <w:r>
+        <w:t xml:space="preserve">ocus on a bold, expressive aesthetic with text and punchy </w:t>
+      </w:r>
+      <w:proofErr w:type="spellStart"/>
+      <w:r>
+        <w:t>colors</w:t>
+      </w:r>
+      <w:proofErr w:type="spellEnd"/>
+      <w:r>
+        <w:t>.</w:t>
+      </w:r>
+    </w:p>
+    <w:p/>
+    <w:p>
+      <w:r>
+        <w:t>Revise the design and layout to make it more professional</w:t>
+      </w:r>
+      <w:r>
+        <w:t xml:space="preserve">. </w:t>
+      </w:r>
+      <w:r>
+        <w:t>Use a wellness-inspired design</w:t>
+      </w:r>
+      <w:r>
+        <w:t>, blue tones, s</w:t>
+      </w:r>
+      <w:r>
+        <w:t xml:space="preserve">oft gradients, </w:t>
+      </w:r>
+      <w:r>
+        <w:t xml:space="preserve">muted earth tones, </w:t>
+      </w:r>
+      <w:r>
+        <w:t>round corners</w:t>
+      </w:r>
+      <w:r>
+        <w:t xml:space="preserve">, </w:t>
+      </w:r>
+      <w:r>
+        <w:t>and generous padding</w:t>
+      </w:r>
+      <w:r>
+        <w:t>. Font is "</w:t>
+      </w:r>
+      <w:proofErr w:type="gramStart"/>
+      <w:r>
+        <w:t>Inter</w:t>
+      </w:r>
+      <w:proofErr w:type="gramEnd"/>
+      <w:r>
+        <w:t xml:space="preserve">". Overall tone </w:t>
+      </w:r>
+      <w:r>
+        <w:t xml:space="preserve">should </w:t>
+      </w:r>
+      <w:r>
+        <w:t>f</w:t>
+      </w:r>
+      <w:r>
+        <w:t>ocus on a bold, expressive aesthetic with text.</w:t>
+      </w:r>
+    </w:p>
+    <w:p/>
+    <w:p>
+      <w:r>
+        <w:t>@page "/dashboard"</w:t>
+      </w:r>
+    </w:p>
+    <w:p>
+      <w:r>
+        <w:t>@page "/dashboard/overview"</w:t>
+      </w:r>
+    </w:p>
+    <w:p>
+      <w:r>
+        <w:t xml:space="preserve">@using </w:t>
+      </w:r>
+      <w:proofErr w:type="spellStart"/>
+      <w:proofErr w:type="gramStart"/>
+      <w:r>
+        <w:t>KenHRApp.Web.Components.Shared</w:t>
+      </w:r>
+      <w:proofErr w:type="spellEnd"/>
+      <w:proofErr w:type="gramEnd"/>
+    </w:p>
+    <w:p/>
+    <w:p>
+      <w:r>
+        <w:t>&lt;</w:t>
+      </w:r>
+      <w:proofErr w:type="spellStart"/>
+      <w:r>
+        <w:rPr>
+          <w:b/>
+          <w:bCs/>
+        </w:rPr>
+        <w:t>PageTitle</w:t>
+      </w:r>
+      <w:proofErr w:type="spellEnd"/>
+      <w:r>
+        <w:t>&gt;Dashboard · KEN-HR&lt;/</w:t>
+      </w:r>
+      <w:proofErr w:type="spellStart"/>
+      <w:r>
+        <w:rPr>
+          <w:b/>
+          <w:bCs/>
+        </w:rPr>
+        <w:t>PageTitle</w:t>
+      </w:r>
+      <w:proofErr w:type="spellEnd"/>
+      <w:r>
+        <w:t>&gt;</w:t>
+      </w:r>
+    </w:p>
+    <w:p/>
+    <w:p>
+      <w:r>
+        <w:t>&lt;</w:t>
+      </w:r>
+      <w:proofErr w:type="spellStart"/>
+      <w:r>
+        <w:rPr>
+          <w:b/>
+          <w:bCs/>
+        </w:rPr>
+        <w:t>PageHeader</w:t>
+      </w:r>
+      <w:proofErr w:type="spellEnd"/>
+      <w:r>
+        <w:t xml:space="preserve"> </w:t>
+      </w:r>
+      <w:r>
+        <w:rPr>
+          <w:b/>
+          <w:bCs/>
+        </w:rPr>
+        <w:t>Title</w:t>
+      </w:r>
+      <w:r>
+        <w:t xml:space="preserve">="Workforce overview" </w:t>
+      </w:r>
+      <w:r>
+        <w:rPr>
+          <w:b/>
+          <w:bCs/>
+        </w:rPr>
+        <w:t>Description</w:t>
+      </w:r>
+      <w:r>
+        <w:t>="Live headcount, attendance and payroll signals across the organisation."&gt;</w:t>
+      </w:r>
+    </w:p>
+    <w:p>
+      <w:r>
+        <w:t xml:space="preserve">    &lt;</w:t>
+      </w:r>
+      <w:r>
+        <w:rPr>
+          <w:b/>
+          <w:bCs/>
+        </w:rPr>
+        <w:t>Actions</w:t>
+      </w:r>
+      <w:r>
+        <w:t>&gt;</w:t>
+      </w:r>
+    </w:p>
+    <w:p>
+      <w:r>
+        <w:lastRenderedPageBreak/>
+        <w:t xml:space="preserve">        &lt;</w:t>
+      </w:r>
+      <w:proofErr w:type="spellStart"/>
+      <w:r>
+        <w:rPr>
+          <w:b/>
+          <w:bCs/>
+        </w:rPr>
+        <w:t>MudButton</w:t>
+      </w:r>
+      <w:proofErr w:type="spellEnd"/>
+      <w:r>
+        <w:t xml:space="preserve"> </w:t>
+      </w:r>
+      <w:r>
+        <w:rPr>
+          <w:b/>
+          <w:bCs/>
+        </w:rPr>
+        <w:t>Variant</w:t>
+      </w:r>
+      <w:r>
+        <w:t>="</w:t>
+      </w:r>
+      <w:proofErr w:type="spellStart"/>
+      <w:r>
+        <w:t>Variant.Outlined</w:t>
+      </w:r>
+      <w:proofErr w:type="spellEnd"/>
+      <w:r>
+        <w:t xml:space="preserve">" </w:t>
+      </w:r>
+      <w:proofErr w:type="spellStart"/>
+      <w:r>
+        <w:rPr>
+          <w:b/>
+          <w:bCs/>
+        </w:rPr>
+        <w:t>StartIcon</w:t>
+      </w:r>
+      <w:proofErr w:type="spellEnd"/>
+      <w:r>
+        <w:t>="@</w:t>
+      </w:r>
+      <w:proofErr w:type="spellStart"/>
+      <w:proofErr w:type="gramStart"/>
+      <w:r>
+        <w:t>Icons.Material.Filled.Download</w:t>
+      </w:r>
+      <w:proofErr w:type="spellEnd"/>
+      <w:proofErr w:type="gramEnd"/>
+      <w:r>
+        <w:t>"&gt;Export&lt;/</w:t>
+      </w:r>
+      <w:proofErr w:type="spellStart"/>
+      <w:r>
+        <w:rPr>
+          <w:b/>
+          <w:bCs/>
+        </w:rPr>
+        <w:t>MudButton</w:t>
+      </w:r>
+      <w:proofErr w:type="spellEnd"/>
+      <w:r>
+        <w:t>&gt;</w:t>
+      </w:r>
+    </w:p>
+    <w:p>
+      <w:r>
+        <w:t xml:space="preserve">        &lt;</w:t>
+      </w:r>
+      <w:proofErr w:type="spellStart"/>
+      <w:r>
+        <w:rPr>
+          <w:b/>
+          <w:bCs/>
+        </w:rPr>
+        <w:t>MudButton</w:t>
+      </w:r>
+      <w:proofErr w:type="spellEnd"/>
+      <w:r>
+        <w:t xml:space="preserve"> </w:t>
+      </w:r>
+      <w:r>
+        <w:rPr>
+          <w:b/>
+          <w:bCs/>
+        </w:rPr>
+        <w:t>Variant</w:t>
+      </w:r>
+      <w:r>
+        <w:t>="</w:t>
+      </w:r>
+      <w:proofErr w:type="spellStart"/>
+      <w:r>
+        <w:t>Variant.Filled</w:t>
+      </w:r>
+      <w:proofErr w:type="spellEnd"/>
+      <w:r>
+        <w:t xml:space="preserve">" </w:t>
+      </w:r>
+      <w:proofErr w:type="spellStart"/>
+      <w:r>
+        <w:rPr>
+          <w:b/>
+          <w:bCs/>
+        </w:rPr>
+        <w:t>Color</w:t>
+      </w:r>
+      <w:proofErr w:type="spellEnd"/>
+      <w:r>
+        <w:t>="</w:t>
+      </w:r>
+      <w:proofErr w:type="spellStart"/>
+      <w:r>
+        <w:t>Color.Primary</w:t>
+      </w:r>
+      <w:proofErr w:type="spellEnd"/>
+      <w:r>
+        <w:t xml:space="preserve">" </w:t>
+      </w:r>
+      <w:proofErr w:type="spellStart"/>
+      <w:r>
+        <w:rPr>
+          <w:b/>
+          <w:bCs/>
+        </w:rPr>
+        <w:t>StartIcon</w:t>
+      </w:r>
+      <w:proofErr w:type="spellEnd"/>
+      <w:r>
+        <w:t>="@</w:t>
+      </w:r>
+      <w:proofErr w:type="spellStart"/>
+      <w:proofErr w:type="gramStart"/>
+      <w:r>
+        <w:t>Icons.Material.Filled.Add</w:t>
+      </w:r>
+      <w:proofErr w:type="spellEnd"/>
+      <w:proofErr w:type="gramEnd"/>
+      <w:r>
+        <w:t xml:space="preserve">" </w:t>
+      </w:r>
+      <w:proofErr w:type="spellStart"/>
+      <w:r>
+        <w:rPr>
+          <w:b/>
+          <w:bCs/>
+        </w:rPr>
+        <w:t>Href</w:t>
+      </w:r>
+      <w:proofErr w:type="spellEnd"/>
+      <w:r>
+        <w:t>="/core-hr/employees"&gt;Add employee&lt;/</w:t>
+      </w:r>
+      <w:proofErr w:type="spellStart"/>
+      <w:r>
+        <w:rPr>
+          <w:b/>
+          <w:bCs/>
+        </w:rPr>
+        <w:t>MudButton</w:t>
+      </w:r>
+      <w:proofErr w:type="spellEnd"/>
+      <w:r>
+        <w:t>&gt;</w:t>
+      </w:r>
+    </w:p>
+    <w:p>
+      <w:r>
+        <w:t xml:space="preserve">    &lt;/</w:t>
+      </w:r>
+      <w:r>
+        <w:rPr>
+          <w:b/>
+          <w:bCs/>
+        </w:rPr>
+        <w:t>Actions</w:t>
+      </w:r>
+      <w:r>
+        <w:t>&gt;</w:t>
+      </w:r>
+    </w:p>
+    <w:p>
+      <w:r>
+        <w:t>&lt;/</w:t>
+      </w:r>
+      <w:proofErr w:type="spellStart"/>
+      <w:r>
+        <w:rPr>
+          <w:b/>
+          <w:bCs/>
+        </w:rPr>
+        <w:t>PageHeader</w:t>
+      </w:r>
+      <w:proofErr w:type="spellEnd"/>
+      <w:r>
+        <w:t>&gt;</w:t>
+      </w:r>
+    </w:p>
+    <w:p/>
+    <w:p>
+      <w:r>
+        <w:t>&lt;</w:t>
+      </w:r>
+      <w:proofErr w:type="spellStart"/>
+      <w:r>
+        <w:rPr>
+          <w:b/>
+          <w:bCs/>
+        </w:rPr>
+        <w:t>MudGrid</w:t>
+      </w:r>
+      <w:proofErr w:type="spellEnd"/>
+      <w:r>
+        <w:t xml:space="preserve"> </w:t>
+      </w:r>
+      <w:r>
+        <w:rPr>
+          <w:b/>
+          <w:bCs/>
+        </w:rPr>
+        <w:t>Spacing</w:t>
+      </w:r>
+      <w:r>
+        <w:t>="3"&gt;</w:t>
+      </w:r>
+    </w:p>
+    <w:p>
+      <w:r>
+        <w:t xml:space="preserve">    &lt;</w:t>
+      </w:r>
+      <w:proofErr w:type="spellStart"/>
+      <w:r>
+        <w:rPr>
+          <w:b/>
+          <w:bCs/>
+        </w:rPr>
+        <w:t>MudItem</w:t>
+      </w:r>
+      <w:proofErr w:type="spellEnd"/>
+      <w:r>
+        <w:t xml:space="preserve"> </w:t>
+      </w:r>
+      <w:proofErr w:type="spellStart"/>
+      <w:r>
+        <w:rPr>
+          <w:b/>
+          <w:bCs/>
+        </w:rPr>
+        <w:t>xs</w:t>
+      </w:r>
+      <w:proofErr w:type="spellEnd"/>
+      <w:r>
+        <w:t xml:space="preserve">="12" </w:t>
+      </w:r>
+      <w:proofErr w:type="spellStart"/>
+      <w:r>
+        <w:rPr>
+          <w:b/>
+          <w:bCs/>
+        </w:rPr>
+        <w:t>sm</w:t>
+      </w:r>
+      <w:proofErr w:type="spellEnd"/>
+      <w:r>
+        <w:t xml:space="preserve">="6" </w:t>
+      </w:r>
+      <w:r>
+        <w:rPr>
+          <w:b/>
+          <w:bCs/>
+        </w:rPr>
+        <w:t>md</w:t>
+      </w:r>
+      <w:r>
+        <w:t>="3"&gt;</w:t>
+      </w:r>
+    </w:p>
+    <w:p>
+      <w:r>
+        <w:t xml:space="preserve">        &lt;</w:t>
+      </w:r>
+      <w:proofErr w:type="spellStart"/>
+      <w:r>
+        <w:rPr>
+          <w:b/>
+          <w:bCs/>
+        </w:rPr>
+        <w:t>KpiCard</w:t>
+      </w:r>
+      <w:proofErr w:type="spellEnd"/>
+      <w:r>
+        <w:t xml:space="preserve"> </w:t>
+      </w:r>
+      <w:r>
+        <w:rPr>
+          <w:b/>
+          <w:bCs/>
+        </w:rPr>
+        <w:t>Label</w:t>
+      </w:r>
+      <w:r>
+        <w:t xml:space="preserve">="Total headcount" </w:t>
+      </w:r>
+      <w:r>
+        <w:rPr>
+          <w:b/>
+          <w:bCs/>
+        </w:rPr>
+        <w:t>Value</w:t>
+      </w:r>
+      <w:r>
+        <w:t>="@</w:t>
+      </w:r>
+      <w:proofErr w:type="spellStart"/>
+      <w:proofErr w:type="gramStart"/>
+      <w:r>
+        <w:t>Kpis.Headcount.ToString</w:t>
+      </w:r>
+      <w:proofErr w:type="spellEnd"/>
+      <w:proofErr w:type="gramEnd"/>
+      <w:r>
+        <w:t xml:space="preserve">("N0")" </w:t>
+      </w:r>
+      <w:r>
+        <w:rPr>
+          <w:b/>
+          <w:bCs/>
+        </w:rPr>
+        <w:t>Icon</w:t>
+      </w:r>
+      <w:r>
+        <w:t xml:space="preserve">="fa-solid fa-users" </w:t>
+      </w:r>
+      <w:r>
+        <w:rPr>
+          <w:b/>
+          <w:bCs/>
+        </w:rPr>
+        <w:t>Trend</w:t>
+      </w:r>
+      <w:r>
+        <w:t>="+2.4% MoM" /&gt;</w:t>
+      </w:r>
+    </w:p>
+    <w:p>
+      <w:r>
+        <w:t xml:space="preserve">    &lt;/</w:t>
+      </w:r>
+      <w:proofErr w:type="spellStart"/>
+      <w:r>
+        <w:rPr>
+          <w:b/>
+          <w:bCs/>
+        </w:rPr>
+        <w:t>MudItem</w:t>
+      </w:r>
+      <w:proofErr w:type="spellEnd"/>
+      <w:r>
+        <w:t>&gt;</w:t>
+      </w:r>
+    </w:p>
+    <w:p>
+      <w:r>
+        <w:t xml:space="preserve">    &lt;</w:t>
+      </w:r>
+      <w:proofErr w:type="spellStart"/>
+      <w:r>
+        <w:rPr>
+          <w:b/>
+          <w:bCs/>
+        </w:rPr>
+        <w:t>MudItem</w:t>
+      </w:r>
+      <w:proofErr w:type="spellEnd"/>
+      <w:r>
+        <w:t xml:space="preserve"> </w:t>
+      </w:r>
+      <w:proofErr w:type="spellStart"/>
+      <w:r>
+        <w:rPr>
+          <w:b/>
+          <w:bCs/>
+        </w:rPr>
+        <w:t>xs</w:t>
+      </w:r>
+      <w:proofErr w:type="spellEnd"/>
+      <w:r>
+        <w:t xml:space="preserve">="12" </w:t>
+      </w:r>
+      <w:proofErr w:type="spellStart"/>
+      <w:r>
+        <w:rPr>
+          <w:b/>
+          <w:bCs/>
+        </w:rPr>
+        <w:t>sm</w:t>
+      </w:r>
+      <w:proofErr w:type="spellEnd"/>
+      <w:r>
+        <w:t xml:space="preserve">="6" </w:t>
+      </w:r>
+      <w:r>
+        <w:rPr>
+          <w:b/>
+          <w:bCs/>
+        </w:rPr>
+        <w:t>md</w:t>
+      </w:r>
+      <w:r>
+        <w:t>="3"&gt;</w:t>
+      </w:r>
+    </w:p>
+    <w:p>
+      <w:r>
+        <w:t xml:space="preserve">        &lt;</w:t>
+      </w:r>
+      <w:proofErr w:type="spellStart"/>
+      <w:r>
+        <w:rPr>
+          <w:b/>
+          <w:bCs/>
+        </w:rPr>
+        <w:t>KpiCard</w:t>
+      </w:r>
+      <w:proofErr w:type="spellEnd"/>
+      <w:r>
+        <w:t xml:space="preserve"> </w:t>
+      </w:r>
+      <w:r>
+        <w:rPr>
+          <w:b/>
+          <w:bCs/>
+        </w:rPr>
+        <w:t>Label</w:t>
+      </w:r>
+      <w:r>
+        <w:t xml:space="preserve">="Present today" </w:t>
+      </w:r>
+      <w:r>
+        <w:rPr>
+          <w:b/>
+          <w:bCs/>
+        </w:rPr>
+        <w:t>Value</w:t>
+      </w:r>
+      <w:r>
+        <w:t>="@</w:t>
+      </w:r>
+      <w:proofErr w:type="spellStart"/>
+      <w:proofErr w:type="gramStart"/>
+      <w:r>
+        <w:t>Kpis.PresentToday.ToString</w:t>
+      </w:r>
+      <w:proofErr w:type="spellEnd"/>
+      <w:proofErr w:type="gramEnd"/>
+      <w:r>
+        <w:t xml:space="preserve">("N0")" </w:t>
+      </w:r>
+      <w:r>
+        <w:rPr>
+          <w:b/>
+          <w:bCs/>
+        </w:rPr>
+        <w:t>Icon</w:t>
+      </w:r>
+      <w:r>
+        <w:t xml:space="preserve">="fa-solid fa-user-check" </w:t>
+      </w:r>
+      <w:proofErr w:type="spellStart"/>
+      <w:r>
+        <w:rPr>
+          <w:b/>
+          <w:bCs/>
+        </w:rPr>
+        <w:t>Color</w:t>
+      </w:r>
+      <w:proofErr w:type="spellEnd"/>
+      <w:r>
+        <w:t>="</w:t>
+      </w:r>
+      <w:proofErr w:type="spellStart"/>
+      <w:r>
+        <w:t>Color.Success</w:t>
+      </w:r>
+      <w:proofErr w:type="spellEnd"/>
+      <w:r>
+        <w:t xml:space="preserve">" </w:t>
+      </w:r>
+      <w:r>
+        <w:rPr>
+          <w:b/>
+          <w:bCs/>
+        </w:rPr>
+        <w:t>Trend</w:t>
+      </w:r>
+      <w:r>
+        <w:t>="94.2% attendance" /&gt;</w:t>
+      </w:r>
+    </w:p>
+    <w:p>
+      <w:r>
+        <w:t xml:space="preserve">    &lt;/</w:t>
+      </w:r>
+      <w:proofErr w:type="spellStart"/>
+      <w:r>
+        <w:rPr>
+          <w:b/>
+          <w:bCs/>
+        </w:rPr>
+        <w:t>MudItem</w:t>
+      </w:r>
+      <w:proofErr w:type="spellEnd"/>
+      <w:r>
+        <w:t>&gt;</w:t>
+      </w:r>
+    </w:p>
+    <w:p>
+      <w:r>
+        <w:t xml:space="preserve">    &lt;</w:t>
+      </w:r>
+      <w:proofErr w:type="spellStart"/>
+      <w:r>
+        <w:rPr>
+          <w:b/>
+          <w:bCs/>
+        </w:rPr>
+        <w:t>MudItem</w:t>
+      </w:r>
+      <w:proofErr w:type="spellEnd"/>
+      <w:r>
+        <w:t xml:space="preserve"> </w:t>
+      </w:r>
+      <w:proofErr w:type="spellStart"/>
+      <w:r>
+        <w:rPr>
+          <w:b/>
+          <w:bCs/>
+        </w:rPr>
+        <w:t>xs</w:t>
+      </w:r>
+      <w:proofErr w:type="spellEnd"/>
+      <w:r>
+        <w:t xml:space="preserve">="12" </w:t>
+      </w:r>
+      <w:proofErr w:type="spellStart"/>
+      <w:r>
+        <w:rPr>
+          <w:b/>
+          <w:bCs/>
+        </w:rPr>
+        <w:t>sm</w:t>
+      </w:r>
+      <w:proofErr w:type="spellEnd"/>
+      <w:r>
+        <w:t xml:space="preserve">="6" </w:t>
+      </w:r>
+      <w:r>
+        <w:rPr>
+          <w:b/>
+          <w:bCs/>
+        </w:rPr>
+        <w:t>md</w:t>
+      </w:r>
+      <w:r>
+        <w:t>="3"&gt;</w:t>
+      </w:r>
+    </w:p>
+    <w:p>
+      <w:r>
+        <w:t xml:space="preserve">        &lt;</w:t>
+      </w:r>
+      <w:proofErr w:type="spellStart"/>
+      <w:r>
+        <w:rPr>
+          <w:b/>
+          <w:bCs/>
+        </w:rPr>
+        <w:t>KpiCard</w:t>
+      </w:r>
+      <w:proofErr w:type="spellEnd"/>
+      <w:r>
+        <w:t xml:space="preserve"> </w:t>
+      </w:r>
+      <w:r>
+        <w:rPr>
+          <w:b/>
+          <w:bCs/>
+        </w:rPr>
+        <w:t>Label</w:t>
+      </w:r>
+      <w:r>
+        <w:t xml:space="preserve">="On leave" </w:t>
+      </w:r>
+      <w:r>
+        <w:rPr>
+          <w:b/>
+          <w:bCs/>
+        </w:rPr>
+        <w:t>Value</w:t>
+      </w:r>
+      <w:r>
+        <w:t>="@</w:t>
+      </w:r>
+      <w:proofErr w:type="spellStart"/>
+      <w:proofErr w:type="gramStart"/>
+      <w:r>
+        <w:t>Kpis.OnLeave.ToString</w:t>
+      </w:r>
+      <w:proofErr w:type="spellEnd"/>
+      <w:proofErr w:type="gramEnd"/>
+      <w:r>
+        <w:t xml:space="preserve">("N0")" </w:t>
+      </w:r>
+      <w:r>
+        <w:rPr>
+          <w:b/>
+          <w:bCs/>
+        </w:rPr>
+        <w:t>Icon</w:t>
+      </w:r>
+      <w:r>
+        <w:t xml:space="preserve">="fa-solid fa-umbrella-beach" </w:t>
+      </w:r>
+      <w:proofErr w:type="spellStart"/>
+      <w:r>
+        <w:rPr>
+          <w:b/>
+          <w:bCs/>
+        </w:rPr>
+        <w:t>Color</w:t>
+      </w:r>
+      <w:proofErr w:type="spellEnd"/>
+      <w:r>
+        <w:t>="</w:t>
+      </w:r>
+      <w:proofErr w:type="spellStart"/>
+      <w:r>
+        <w:t>Color.Warning</w:t>
+      </w:r>
+      <w:proofErr w:type="spellEnd"/>
+      <w:r>
+        <w:t xml:space="preserve">" </w:t>
+      </w:r>
+      <w:r>
+        <w:rPr>
+          <w:b/>
+          <w:bCs/>
+        </w:rPr>
+        <w:t>Trend</w:t>
+      </w:r>
+      <w:r>
+        <w:t xml:space="preserve">="-3 vs. yesterday" </w:t>
+      </w:r>
+      <w:proofErr w:type="spellStart"/>
+      <w:r>
+        <w:rPr>
+          <w:b/>
+          <w:bCs/>
+        </w:rPr>
+        <w:t>TrendPositive</w:t>
+      </w:r>
+      <w:proofErr w:type="spellEnd"/>
+      <w:r>
+        <w:t>="false" /&gt;</w:t>
+      </w:r>
+    </w:p>
+    <w:p>
+      <w:r>
+        <w:t xml:space="preserve">    &lt;/</w:t>
+      </w:r>
+      <w:proofErr w:type="spellStart"/>
+      <w:r>
+        <w:rPr>
+          <w:b/>
+          <w:bCs/>
+        </w:rPr>
+        <w:t>MudItem</w:t>
+      </w:r>
+      <w:proofErr w:type="spellEnd"/>
+      <w:r>
+        <w:t>&gt;</w:t>
+      </w:r>
+    </w:p>
+    <w:p>
+      <w:r>
+        <w:t xml:space="preserve">    &lt;</w:t>
+      </w:r>
+      <w:proofErr w:type="spellStart"/>
+      <w:r>
+        <w:rPr>
+          <w:b/>
+          <w:bCs/>
+        </w:rPr>
+        <w:t>MudItem</w:t>
+      </w:r>
+      <w:proofErr w:type="spellEnd"/>
+      <w:r>
+        <w:t xml:space="preserve"> </w:t>
+      </w:r>
+      <w:proofErr w:type="spellStart"/>
+      <w:r>
+        <w:rPr>
+          <w:b/>
+          <w:bCs/>
+        </w:rPr>
+        <w:t>xs</w:t>
+      </w:r>
+      <w:proofErr w:type="spellEnd"/>
+      <w:r>
+        <w:t xml:space="preserve">="12" </w:t>
+      </w:r>
+      <w:proofErr w:type="spellStart"/>
+      <w:r>
+        <w:rPr>
+          <w:b/>
+          <w:bCs/>
+        </w:rPr>
+        <w:t>sm</w:t>
+      </w:r>
+      <w:proofErr w:type="spellEnd"/>
+      <w:r>
+        <w:t xml:space="preserve">="6" </w:t>
+      </w:r>
+      <w:r>
+        <w:rPr>
+          <w:b/>
+          <w:bCs/>
+        </w:rPr>
+        <w:t>md</w:t>
+      </w:r>
+      <w:r>
+        <w:t>="3"&gt;</w:t>
+      </w:r>
+    </w:p>
+    <w:p>
+      <w:r>
+        <w:t xml:space="preserve">        &lt;</w:t>
+      </w:r>
+      <w:proofErr w:type="spellStart"/>
+      <w:r>
+        <w:rPr>
+          <w:b/>
+          <w:bCs/>
+        </w:rPr>
+        <w:t>KpiCard</w:t>
+      </w:r>
+      <w:proofErr w:type="spellEnd"/>
+      <w:r>
+        <w:t xml:space="preserve"> </w:t>
+      </w:r>
+      <w:r>
+        <w:rPr>
+          <w:b/>
+          <w:bCs/>
+        </w:rPr>
+        <w:t>Label</w:t>
+      </w:r>
+      <w:r>
+        <w:t xml:space="preserve">="Open requisitions" </w:t>
+      </w:r>
+      <w:r>
+        <w:rPr>
+          <w:b/>
+          <w:bCs/>
+        </w:rPr>
+        <w:t>Value</w:t>
+      </w:r>
+      <w:r>
+        <w:t>="@</w:t>
+      </w:r>
+      <w:proofErr w:type="spellStart"/>
+      <w:proofErr w:type="gramStart"/>
+      <w:r>
+        <w:t>Kpis.OpenRequisitions.ToString</w:t>
+      </w:r>
+      <w:proofErr w:type="spellEnd"/>
+      <w:proofErr w:type="gramEnd"/>
+      <w:r>
+        <w:t xml:space="preserve">("N0")" </w:t>
+      </w:r>
+      <w:r>
+        <w:rPr>
+          <w:b/>
+          <w:bCs/>
+        </w:rPr>
+        <w:t>Icon</w:t>
+      </w:r>
+      <w:r>
+        <w:t xml:space="preserve">="fa-solid fa-briefcase" </w:t>
+      </w:r>
+      <w:proofErr w:type="spellStart"/>
+      <w:r>
+        <w:rPr>
+          <w:b/>
+          <w:bCs/>
+        </w:rPr>
+        <w:t>Color</w:t>
+      </w:r>
+      <w:proofErr w:type="spellEnd"/>
+      <w:r>
+        <w:t>="</w:t>
+      </w:r>
+      <w:proofErr w:type="spellStart"/>
+      <w:r>
+        <w:t>Color.Tertiary</w:t>
+      </w:r>
+      <w:proofErr w:type="spellEnd"/>
+      <w:r>
+        <w:t xml:space="preserve">" </w:t>
+      </w:r>
+      <w:r>
+        <w:rPr>
+          <w:b/>
+          <w:bCs/>
+        </w:rPr>
+        <w:t>Trend</w:t>
+      </w:r>
+      <w:r>
+        <w:t>="+6 this month" /&gt;</w:t>
+      </w:r>
+    </w:p>
+    <w:p>
+      <w:r>
+        <w:t xml:space="preserve">    &lt;/</w:t>
+      </w:r>
+      <w:proofErr w:type="spellStart"/>
+      <w:r>
+        <w:rPr>
+          <w:b/>
+          <w:bCs/>
+        </w:rPr>
+        <w:t>MudItem</w:t>
+      </w:r>
+      <w:proofErr w:type="spellEnd"/>
+      <w:r>
+        <w:t>&gt;</w:t>
+      </w:r>
+    </w:p>
+    <w:p/>
+    <w:p>
+      <w:r>
+        <w:t xml:space="preserve">    &lt;</w:t>
+      </w:r>
+      <w:proofErr w:type="spellStart"/>
+      <w:r>
+        <w:rPr>
+          <w:b/>
+          <w:bCs/>
+        </w:rPr>
+        <w:t>MudItem</w:t>
+      </w:r>
+      <w:proofErr w:type="spellEnd"/>
+      <w:r>
+        <w:t xml:space="preserve"> </w:t>
+      </w:r>
+      <w:proofErr w:type="spellStart"/>
+      <w:r>
+        <w:rPr>
+          <w:b/>
+          <w:bCs/>
+        </w:rPr>
+        <w:t>xs</w:t>
+      </w:r>
+      <w:proofErr w:type="spellEnd"/>
+      <w:r>
+        <w:t xml:space="preserve">="12" </w:t>
+      </w:r>
+      <w:r>
+        <w:rPr>
+          <w:b/>
+          <w:bCs/>
+        </w:rPr>
+        <w:t>md</w:t>
+      </w:r>
+      <w:r>
+        <w:t>="8"&gt;</w:t>
+      </w:r>
+    </w:p>
+    <w:p>
+      <w:r>
+        <w:t xml:space="preserve">        &lt;</w:t>
+      </w:r>
+      <w:proofErr w:type="spellStart"/>
+      <w:r>
+        <w:rPr>
+          <w:b/>
+          <w:bCs/>
+        </w:rPr>
+        <w:t>MudPaper</w:t>
+      </w:r>
+      <w:proofErr w:type="spellEnd"/>
+      <w:r>
+        <w:t xml:space="preserve"> </w:t>
+      </w:r>
+      <w:r>
+        <w:rPr>
+          <w:b/>
+          <w:bCs/>
+        </w:rPr>
+        <w:t>Class</w:t>
+      </w:r>
+      <w:r>
+        <w:t xml:space="preserve">="pa-4" </w:t>
+      </w:r>
+      <w:r>
+        <w:rPr>
+          <w:b/>
+          <w:bCs/>
+        </w:rPr>
+        <w:t>Elevation</w:t>
+      </w:r>
+      <w:r>
+        <w:t>="1"&gt;</w:t>
+      </w:r>
+    </w:p>
+    <w:p>
+      <w:r>
+        <w:t xml:space="preserve">            &lt;</w:t>
+      </w:r>
+      <w:proofErr w:type="spellStart"/>
+      <w:r>
+        <w:rPr>
+          <w:b/>
+          <w:bCs/>
+        </w:rPr>
+        <w:t>MudText</w:t>
+      </w:r>
+      <w:proofErr w:type="spellEnd"/>
+      <w:r>
+        <w:t xml:space="preserve"> </w:t>
+      </w:r>
+      <w:r>
+        <w:rPr>
+          <w:b/>
+          <w:bCs/>
+        </w:rPr>
+        <w:t>Typo</w:t>
+      </w:r>
+      <w:r>
+        <w:t xml:space="preserve">="Typo.h3" </w:t>
+      </w:r>
+      <w:r>
+        <w:rPr>
+          <w:b/>
+          <w:bCs/>
+        </w:rPr>
+        <w:t>Class</w:t>
+      </w:r>
+      <w:r>
+        <w:t>="mb-4"&gt;Headcount trend&lt;/</w:t>
+      </w:r>
+      <w:proofErr w:type="spellStart"/>
+      <w:r>
+        <w:rPr>
+          <w:b/>
+          <w:bCs/>
+        </w:rPr>
+        <w:t>MudText</w:t>
+      </w:r>
+      <w:proofErr w:type="spellEnd"/>
+      <w:r>
+        <w:t>&gt;</w:t>
+      </w:r>
+    </w:p>
+    <w:p>
+      <w:r>
+        <w:t xml:space="preserve">            &lt;</w:t>
+      </w:r>
+      <w:proofErr w:type="spellStart"/>
+      <w:r>
+        <w:rPr>
+          <w:b/>
+          <w:bCs/>
+        </w:rPr>
+        <w:t>MudChart</w:t>
+      </w:r>
+      <w:proofErr w:type="spellEnd"/>
+      <w:r>
+        <w:t xml:space="preserve"> </w:t>
+      </w:r>
+      <w:proofErr w:type="spellStart"/>
+      <w:r>
+        <w:rPr>
+          <w:b/>
+          <w:bCs/>
+        </w:rPr>
+        <w:t>ChartType</w:t>
+      </w:r>
+      <w:proofErr w:type="spellEnd"/>
+      <w:r>
+        <w:t>="</w:t>
+      </w:r>
+      <w:proofErr w:type="spellStart"/>
+      <w:r>
+        <w:t>ChartType.Line</w:t>
+      </w:r>
+      <w:proofErr w:type="spellEnd"/>
+      <w:r>
+        <w:t>"</w:t>
+      </w:r>
+    </w:p>
+    <w:p>
+      <w:r>
+        <w:t xml:space="preserve">                      </w:t>
+      </w:r>
+      <w:proofErr w:type="spellStart"/>
+      <w:r>
+        <w:rPr>
+          <w:b/>
+          <w:bCs/>
+        </w:rPr>
+        <w:t>ChartSeries</w:t>
+      </w:r>
+      <w:proofErr w:type="spellEnd"/>
+      <w:r>
+        <w:t>="@</w:t>
+      </w:r>
+      <w:proofErr w:type="spellStart"/>
+      <w:r>
+        <w:t>HeadcountSeries</w:t>
+      </w:r>
+      <w:proofErr w:type="spellEnd"/>
+      <w:r>
+        <w:t>"</w:t>
+      </w:r>
+    </w:p>
+    <w:p>
+      <w:r>
+        <w:t xml:space="preserve">                      </w:t>
+      </w:r>
+      <w:proofErr w:type="spellStart"/>
+      <w:r>
+        <w:rPr>
+          <w:b/>
+          <w:bCs/>
+        </w:rPr>
+        <w:t>XAxisLabels</w:t>
+      </w:r>
+      <w:proofErr w:type="spellEnd"/>
+      <w:r>
+        <w:t>="@Months"</w:t>
+      </w:r>
+    </w:p>
+    <w:p>
+      <w:r>
+        <w:t xml:space="preserve">                      </w:t>
+      </w:r>
+      <w:r>
+        <w:rPr>
+          <w:b/>
+          <w:bCs/>
+        </w:rPr>
+        <w:t>Width</w:t>
+      </w:r>
+      <w:r>
+        <w:t>="100%"</w:t>
+      </w:r>
+    </w:p>
+    <w:p>
+      <w:r>
+        <w:lastRenderedPageBreak/>
+        <w:t xml:space="preserve">                      </w:t>
+      </w:r>
+      <w:r>
+        <w:rPr>
+          <w:b/>
+          <w:bCs/>
+        </w:rPr>
+        <w:t>Height</w:t>
+      </w:r>
+      <w:r>
+        <w:t>="320px" /&gt;</w:t>
+      </w:r>
+    </w:p>
+    <w:p>
+      <w:r>
+        <w:t xml:space="preserve">        &lt;/</w:t>
+      </w:r>
+      <w:proofErr w:type="spellStart"/>
+      <w:r>
+        <w:rPr>
+          <w:b/>
+          <w:bCs/>
+        </w:rPr>
+        <w:t>MudPaper</w:t>
+      </w:r>
+      <w:proofErr w:type="spellEnd"/>
+      <w:r>
+        <w:t>&gt;</w:t>
+      </w:r>
+    </w:p>
+    <w:p>
+      <w:r>
+        <w:t xml:space="preserve">    &lt;/</w:t>
+      </w:r>
+      <w:proofErr w:type="spellStart"/>
+      <w:r>
+        <w:rPr>
+          <w:b/>
+          <w:bCs/>
+        </w:rPr>
+        <w:t>MudItem</w:t>
+      </w:r>
+      <w:proofErr w:type="spellEnd"/>
+      <w:r>
+        <w:t>&gt;</w:t>
+      </w:r>
+    </w:p>
+    <w:p/>
+    <w:p>
+      <w:r>
+        <w:t xml:space="preserve">    &lt;</w:t>
+      </w:r>
+      <w:proofErr w:type="spellStart"/>
+      <w:r>
+        <w:rPr>
+          <w:b/>
+          <w:bCs/>
+        </w:rPr>
+        <w:t>MudItem</w:t>
+      </w:r>
+      <w:proofErr w:type="spellEnd"/>
+      <w:r>
+        <w:t xml:space="preserve"> </w:t>
+      </w:r>
+      <w:proofErr w:type="spellStart"/>
+      <w:r>
+        <w:rPr>
+          <w:b/>
+          <w:bCs/>
+        </w:rPr>
+        <w:t>xs</w:t>
+      </w:r>
+      <w:proofErr w:type="spellEnd"/>
+      <w:r>
+        <w:t xml:space="preserve">="12" </w:t>
+      </w:r>
+      <w:r>
+        <w:rPr>
+          <w:b/>
+          <w:bCs/>
+        </w:rPr>
+        <w:t>md</w:t>
+      </w:r>
+      <w:r>
+        <w:t>="4"&gt;</w:t>
+      </w:r>
+    </w:p>
+    <w:p>
+      <w:r>
+        <w:t xml:space="preserve">        &lt;</w:t>
+      </w:r>
+      <w:proofErr w:type="spellStart"/>
+      <w:r>
+        <w:rPr>
+          <w:b/>
+          <w:bCs/>
+        </w:rPr>
+        <w:t>MudPaper</w:t>
+      </w:r>
+      <w:proofErr w:type="spellEnd"/>
+      <w:r>
+        <w:t xml:space="preserve"> </w:t>
+      </w:r>
+      <w:r>
+        <w:rPr>
+          <w:b/>
+          <w:bCs/>
+        </w:rPr>
+        <w:t>Class</w:t>
+      </w:r>
+      <w:r>
+        <w:t xml:space="preserve">="pa-4" </w:t>
+      </w:r>
+      <w:r>
+        <w:rPr>
+          <w:b/>
+          <w:bCs/>
+        </w:rPr>
+        <w:t>Elevation</w:t>
+      </w:r>
+      <w:r>
+        <w:t>="1"&gt;</w:t>
+      </w:r>
+    </w:p>
+    <w:p>
+      <w:r>
+        <w:t xml:space="preserve">            &lt;</w:t>
+      </w:r>
+      <w:proofErr w:type="spellStart"/>
+      <w:r>
+        <w:rPr>
+          <w:b/>
+          <w:bCs/>
+        </w:rPr>
+        <w:t>MudText</w:t>
+      </w:r>
+      <w:proofErr w:type="spellEnd"/>
+      <w:r>
+        <w:t xml:space="preserve"> </w:t>
+      </w:r>
+      <w:r>
+        <w:rPr>
+          <w:b/>
+          <w:bCs/>
+        </w:rPr>
+        <w:t>Typo</w:t>
+      </w:r>
+      <w:r>
+        <w:t xml:space="preserve">="Typo.h3" </w:t>
+      </w:r>
+      <w:r>
+        <w:rPr>
+          <w:b/>
+          <w:bCs/>
+        </w:rPr>
+        <w:t>Class</w:t>
+      </w:r>
+      <w:r>
+        <w:t>="mb-4"&gt;Workforce by division&lt;/</w:t>
+      </w:r>
+      <w:proofErr w:type="spellStart"/>
+      <w:r>
+        <w:rPr>
+          <w:b/>
+          <w:bCs/>
+        </w:rPr>
+        <w:t>MudText</w:t>
+      </w:r>
+      <w:proofErr w:type="spellEnd"/>
+      <w:r>
+        <w:t>&gt;</w:t>
+      </w:r>
+    </w:p>
+    <w:p>
+      <w:r>
+        <w:t xml:space="preserve">            &lt;</w:t>
+      </w:r>
+      <w:proofErr w:type="spellStart"/>
+      <w:r>
+        <w:rPr>
+          <w:b/>
+          <w:bCs/>
+        </w:rPr>
+        <w:t>MudChart</w:t>
+      </w:r>
+      <w:proofErr w:type="spellEnd"/>
+      <w:r>
+        <w:t xml:space="preserve"> </w:t>
+      </w:r>
+      <w:proofErr w:type="spellStart"/>
+      <w:r>
+        <w:rPr>
+          <w:b/>
+          <w:bCs/>
+        </w:rPr>
+        <w:t>ChartType</w:t>
+      </w:r>
+      <w:proofErr w:type="spellEnd"/>
+      <w:r>
+        <w:t>="</w:t>
+      </w:r>
+      <w:proofErr w:type="spellStart"/>
+      <w:r>
+        <w:t>ChartType.Donut</w:t>
+      </w:r>
+      <w:proofErr w:type="spellEnd"/>
+      <w:r>
+        <w:t>"</w:t>
+      </w:r>
+    </w:p>
+    <w:p>
+      <w:r>
+        <w:t xml:space="preserve">                      </w:t>
+      </w:r>
+      <w:proofErr w:type="spellStart"/>
+      <w:r>
+        <w:rPr>
+          <w:b/>
+          <w:bCs/>
+        </w:rPr>
+        <w:t>InputData</w:t>
+      </w:r>
+      <w:proofErr w:type="spellEnd"/>
+      <w:r>
+        <w:t>="@</w:t>
+      </w:r>
+      <w:proofErr w:type="spellStart"/>
+      <w:r>
+        <w:t>DivisionData</w:t>
+      </w:r>
+      <w:proofErr w:type="spellEnd"/>
+      <w:r>
+        <w:t>"</w:t>
+      </w:r>
+    </w:p>
+    <w:p>
+      <w:r>
+        <w:t xml:space="preserve">                      </w:t>
+      </w:r>
+      <w:proofErr w:type="spellStart"/>
+      <w:r>
+        <w:rPr>
+          <w:b/>
+          <w:bCs/>
+        </w:rPr>
+        <w:t>InputLabels</w:t>
+      </w:r>
+      <w:proofErr w:type="spellEnd"/>
+      <w:r>
+        <w:t>="@</w:t>
+      </w:r>
+      <w:proofErr w:type="spellStart"/>
+      <w:r>
+        <w:t>DivisionLabels</w:t>
+      </w:r>
+      <w:proofErr w:type="spellEnd"/>
+      <w:r>
+        <w:t>"</w:t>
+      </w:r>
+    </w:p>
+    <w:p>
+      <w:r>
+        <w:t xml:space="preserve">                      </w:t>
+      </w:r>
+      <w:r>
+        <w:rPr>
+          <w:b/>
+          <w:bCs/>
+        </w:rPr>
+        <w:t>Width</w:t>
+      </w:r>
+      <w:r>
+        <w:t>="100%"</w:t>
+      </w:r>
+    </w:p>
+    <w:p>
+      <w:r>
+        <w:t xml:space="preserve">                      </w:t>
+      </w:r>
+      <w:r>
+        <w:rPr>
+          <w:b/>
+          <w:bCs/>
+        </w:rPr>
+        <w:t>Height</w:t>
+      </w:r>
+      <w:r>
+        <w:t>="300px" /&gt;</w:t>
+      </w:r>
+    </w:p>
+    <w:p>
+      <w:r>
+        <w:t xml:space="preserve">        &lt;/</w:t>
+      </w:r>
+      <w:proofErr w:type="spellStart"/>
+      <w:r>
+        <w:rPr>
+          <w:b/>
+          <w:bCs/>
+        </w:rPr>
+        <w:t>MudPaper</w:t>
+      </w:r>
+      <w:proofErr w:type="spellEnd"/>
+      <w:r>
+        <w:t>&gt;</w:t>
+      </w:r>
+    </w:p>
+    <w:p>
+      <w:r>
+        <w:t xml:space="preserve">    &lt;/</w:t>
+      </w:r>
+      <w:proofErr w:type="spellStart"/>
+      <w:r>
+        <w:rPr>
+          <w:b/>
+          <w:bCs/>
+        </w:rPr>
+        <w:t>MudItem</w:t>
+      </w:r>
+      <w:proofErr w:type="spellEnd"/>
+      <w:r>
+        <w:t>&gt;</w:t>
+      </w:r>
+    </w:p>
+    <w:p/>
+    <w:p>
+      <w:r>
+        <w:t xml:space="preserve">    &lt;</w:t>
+      </w:r>
+      <w:proofErr w:type="spellStart"/>
+      <w:r>
+        <w:rPr>
+          <w:b/>
+          <w:bCs/>
+        </w:rPr>
+        <w:t>MudItem</w:t>
+      </w:r>
+      <w:proofErr w:type="spellEnd"/>
+      <w:r>
+        <w:t xml:space="preserve"> </w:t>
+      </w:r>
+      <w:proofErr w:type="spellStart"/>
+      <w:r>
+        <w:rPr>
+          <w:b/>
+          <w:bCs/>
+        </w:rPr>
+        <w:t>xs</w:t>
+      </w:r>
+      <w:proofErr w:type="spellEnd"/>
+      <w:r>
+        <w:t xml:space="preserve">="12" </w:t>
+      </w:r>
+      <w:r>
+        <w:rPr>
+          <w:b/>
+          <w:bCs/>
+        </w:rPr>
+        <w:t>md</w:t>
+      </w:r>
+      <w:r>
+        <w:t>="7"&gt;</w:t>
+      </w:r>
+    </w:p>
+    <w:p>
+      <w:r>
+        <w:t xml:space="preserve">        &lt;</w:t>
+      </w:r>
+      <w:proofErr w:type="spellStart"/>
+      <w:r>
+        <w:rPr>
+          <w:b/>
+          <w:bCs/>
+        </w:rPr>
+        <w:t>MudPaper</w:t>
+      </w:r>
+      <w:proofErr w:type="spellEnd"/>
+      <w:r>
+        <w:t xml:space="preserve"> </w:t>
+      </w:r>
+      <w:r>
+        <w:rPr>
+          <w:b/>
+          <w:bCs/>
+        </w:rPr>
+        <w:t>Class</w:t>
+      </w:r>
+      <w:r>
+        <w:t xml:space="preserve">="pa-4" </w:t>
+      </w:r>
+      <w:r>
+        <w:rPr>
+          <w:b/>
+          <w:bCs/>
+        </w:rPr>
+        <w:t>Elevation</w:t>
+      </w:r>
+      <w:r>
+        <w:t>="1"&gt;</w:t>
+      </w:r>
+    </w:p>
+    <w:p>
+      <w:r>
+        <w:t xml:space="preserve">            &lt;</w:t>
+      </w:r>
+      <w:proofErr w:type="spellStart"/>
+      <w:r>
+        <w:rPr>
+          <w:b/>
+          <w:bCs/>
+        </w:rPr>
+        <w:t>MudText</w:t>
+      </w:r>
+      <w:proofErr w:type="spellEnd"/>
+      <w:r>
+        <w:t xml:space="preserve"> </w:t>
+      </w:r>
+      <w:r>
+        <w:rPr>
+          <w:b/>
+          <w:bCs/>
+        </w:rPr>
+        <w:t>Typo</w:t>
+      </w:r>
+      <w:r>
+        <w:t xml:space="preserve">="Typo.h3" </w:t>
+      </w:r>
+      <w:r>
+        <w:rPr>
+          <w:b/>
+          <w:bCs/>
+        </w:rPr>
+        <w:t>Class</w:t>
+      </w:r>
+      <w:r>
+        <w:t>="mb-4"&gt;Attendance this week&lt;/</w:t>
+      </w:r>
+      <w:proofErr w:type="spellStart"/>
+      <w:r>
+        <w:rPr>
+          <w:b/>
+          <w:bCs/>
+        </w:rPr>
+        <w:t>MudText</w:t>
+      </w:r>
+      <w:proofErr w:type="spellEnd"/>
+      <w:r>
+        <w:t>&gt;</w:t>
+      </w:r>
+    </w:p>
+    <w:p>
+      <w:r>
+        <w:t xml:space="preserve">            &lt;</w:t>
+      </w:r>
+      <w:proofErr w:type="spellStart"/>
+      <w:r>
+        <w:rPr>
+          <w:b/>
+          <w:bCs/>
+        </w:rPr>
+        <w:t>MudChart</w:t>
+      </w:r>
+      <w:proofErr w:type="spellEnd"/>
+      <w:r>
+        <w:t xml:space="preserve"> </w:t>
+      </w:r>
+      <w:proofErr w:type="spellStart"/>
+      <w:r>
+        <w:rPr>
+          <w:b/>
+          <w:bCs/>
+        </w:rPr>
+        <w:t>ChartType</w:t>
+      </w:r>
+      <w:proofErr w:type="spellEnd"/>
+      <w:r>
+        <w:t>="</w:t>
+      </w:r>
+      <w:proofErr w:type="spellStart"/>
+      <w:r>
+        <w:t>ChartType.Bar</w:t>
+      </w:r>
+      <w:proofErr w:type="spellEnd"/>
+      <w:r>
+        <w:t>"</w:t>
+      </w:r>
+    </w:p>
+    <w:p>
+      <w:r>
+        <w:t xml:space="preserve">                      </w:t>
+      </w:r>
+      <w:proofErr w:type="spellStart"/>
+      <w:r>
+        <w:rPr>
+          <w:b/>
+          <w:bCs/>
+        </w:rPr>
+        <w:t>ChartSeries</w:t>
+      </w:r>
+      <w:proofErr w:type="spellEnd"/>
+      <w:r>
+        <w:t>="@</w:t>
+      </w:r>
+      <w:proofErr w:type="spellStart"/>
+      <w:r>
+        <w:t>AttendanceSeries</w:t>
+      </w:r>
+      <w:proofErr w:type="spellEnd"/>
+      <w:r>
+        <w:t>"</w:t>
+      </w:r>
+    </w:p>
+    <w:p>
+      <w:r>
+        <w:t xml:space="preserve">                      </w:t>
+      </w:r>
+      <w:proofErr w:type="spellStart"/>
+      <w:r>
+        <w:rPr>
+          <w:b/>
+          <w:bCs/>
+        </w:rPr>
+        <w:t>XAxisLabels</w:t>
+      </w:r>
+      <w:proofErr w:type="spellEnd"/>
+      <w:r>
+        <w:t>="@Weekdays"</w:t>
+      </w:r>
+    </w:p>
+    <w:p>
+      <w:r>
+        <w:t xml:space="preserve">                      </w:t>
+      </w:r>
+      <w:r>
+        <w:rPr>
+          <w:b/>
+          <w:bCs/>
+        </w:rPr>
+        <w:t>Width</w:t>
+      </w:r>
+      <w:r>
+        <w:t>="100%"</w:t>
+      </w:r>
+    </w:p>
+    <w:p>
+      <w:r>
+        <w:t xml:space="preserve">                      </w:t>
+      </w:r>
+      <w:r>
+        <w:rPr>
+          <w:b/>
+          <w:bCs/>
+        </w:rPr>
+        <w:t>Height</w:t>
+      </w:r>
+      <w:r>
+        <w:t>="300px" /&gt;</w:t>
+      </w:r>
+    </w:p>
+    <w:p>
+      <w:r>
+        <w:t xml:space="preserve">        &lt;/</w:t>
+      </w:r>
+      <w:proofErr w:type="spellStart"/>
+      <w:r>
+        <w:rPr>
+          <w:b/>
+          <w:bCs/>
+        </w:rPr>
+        <w:t>MudPaper</w:t>
+      </w:r>
+      <w:proofErr w:type="spellEnd"/>
+      <w:r>
+        <w:t>&gt;</w:t>
+      </w:r>
+    </w:p>
+    <w:p>
+      <w:r>
+        <w:t xml:space="preserve">    &lt;/</w:t>
+      </w:r>
+      <w:proofErr w:type="spellStart"/>
+      <w:r>
+        <w:rPr>
+          <w:b/>
+          <w:bCs/>
+        </w:rPr>
+        <w:t>MudItem</w:t>
+      </w:r>
+      <w:proofErr w:type="spellEnd"/>
+      <w:r>
+        <w:t>&gt;</w:t>
+      </w:r>
+    </w:p>
+    <w:p/>
+    <w:p>
+      <w:r>
+        <w:t xml:space="preserve">    &lt;</w:t>
+      </w:r>
+      <w:proofErr w:type="spellStart"/>
+      <w:r>
+        <w:rPr>
+          <w:b/>
+          <w:bCs/>
+        </w:rPr>
+        <w:t>MudItem</w:t>
+      </w:r>
+      <w:proofErr w:type="spellEnd"/>
+      <w:r>
+        <w:t xml:space="preserve"> </w:t>
+      </w:r>
+      <w:proofErr w:type="spellStart"/>
+      <w:r>
+        <w:rPr>
+          <w:b/>
+          <w:bCs/>
+        </w:rPr>
+        <w:t>xs</w:t>
+      </w:r>
+      <w:proofErr w:type="spellEnd"/>
+      <w:r>
+        <w:t xml:space="preserve">="12" </w:t>
+      </w:r>
+      <w:r>
+        <w:rPr>
+          <w:b/>
+          <w:bCs/>
+        </w:rPr>
+        <w:t>md</w:t>
+      </w:r>
+      <w:r>
+        <w:t>="5"&gt;</w:t>
+      </w:r>
+    </w:p>
+    <w:p>
+      <w:r>
+        <w:t xml:space="preserve">        &lt;</w:t>
+      </w:r>
+      <w:proofErr w:type="spellStart"/>
+      <w:r>
+        <w:rPr>
+          <w:b/>
+          <w:bCs/>
+        </w:rPr>
+        <w:t>MudPaper</w:t>
+      </w:r>
+      <w:proofErr w:type="spellEnd"/>
+      <w:r>
+        <w:t xml:space="preserve"> </w:t>
+      </w:r>
+      <w:r>
+        <w:rPr>
+          <w:b/>
+          <w:bCs/>
+        </w:rPr>
+        <w:t>Class</w:t>
+      </w:r>
+      <w:r>
+        <w:t xml:space="preserve">="pa-4" </w:t>
+      </w:r>
+      <w:r>
+        <w:rPr>
+          <w:b/>
+          <w:bCs/>
+        </w:rPr>
+        <w:t>Elevation</w:t>
+      </w:r>
+      <w:r>
+        <w:t>="1"&gt;</w:t>
+      </w:r>
+    </w:p>
+    <w:p>
+      <w:r>
+        <w:t xml:space="preserve">            &lt;</w:t>
+      </w:r>
+      <w:proofErr w:type="spellStart"/>
+      <w:r>
+        <w:rPr>
+          <w:b/>
+          <w:bCs/>
+        </w:rPr>
+        <w:t>MudText</w:t>
+      </w:r>
+      <w:proofErr w:type="spellEnd"/>
+      <w:r>
+        <w:t xml:space="preserve"> </w:t>
+      </w:r>
+      <w:r>
+        <w:rPr>
+          <w:b/>
+          <w:bCs/>
+        </w:rPr>
+        <w:t>Typo</w:t>
+      </w:r>
+      <w:r>
+        <w:t xml:space="preserve">="Typo.h3" </w:t>
+      </w:r>
+      <w:r>
+        <w:rPr>
+          <w:b/>
+          <w:bCs/>
+        </w:rPr>
+        <w:t>Class</w:t>
+      </w:r>
+      <w:r>
+        <w:t>="mb-2"&gt;Recent activity&lt;/</w:t>
+      </w:r>
+      <w:proofErr w:type="spellStart"/>
+      <w:r>
+        <w:rPr>
+          <w:b/>
+          <w:bCs/>
+        </w:rPr>
+        <w:t>MudText</w:t>
+      </w:r>
+      <w:proofErr w:type="spellEnd"/>
+      <w:r>
+        <w:t>&gt;</w:t>
+      </w:r>
+    </w:p>
+    <w:p>
+      <w:r>
+        <w:t xml:space="preserve">            &lt;</w:t>
+      </w:r>
+      <w:r>
+        <w:rPr>
+          <w:b/>
+          <w:bCs/>
+        </w:rPr>
+        <w:t>Timeline</w:t>
+      </w:r>
+      <w:r>
+        <w:t xml:space="preserve"> </w:t>
+      </w:r>
+      <w:r>
+        <w:rPr>
+          <w:b/>
+          <w:bCs/>
+        </w:rPr>
+        <w:t>Entries</w:t>
+      </w:r>
+      <w:r>
+        <w:t>="Activity" /&gt;</w:t>
+      </w:r>
+    </w:p>
+    <w:p>
+      <w:r>
+        <w:t xml:space="preserve">        &lt;/</w:t>
+      </w:r>
+      <w:proofErr w:type="spellStart"/>
+      <w:r>
+        <w:rPr>
+          <w:b/>
+          <w:bCs/>
+        </w:rPr>
+        <w:t>MudPaper</w:t>
+      </w:r>
+      <w:proofErr w:type="spellEnd"/>
+      <w:r>
+        <w:t>&gt;</w:t>
+      </w:r>
+    </w:p>
+    <w:p>
+      <w:r>
+        <w:lastRenderedPageBreak/>
+        <w:t xml:space="preserve">    &lt;/</w:t>
+      </w:r>
+      <w:proofErr w:type="spellStart"/>
+      <w:r>
+        <w:rPr>
+          <w:b/>
+          <w:bCs/>
+        </w:rPr>
+        <w:t>MudItem</w:t>
+      </w:r>
+      <w:proofErr w:type="spellEnd"/>
+      <w:r>
+        <w:t>&gt;</w:t>
+      </w:r>
+    </w:p>
+    <w:p>
+      <w:r>
+        <w:t>&lt;/</w:t>
+      </w:r>
+      <w:proofErr w:type="spellStart"/>
+      <w:r>
+        <w:rPr>
+          <w:b/>
+          <w:bCs/>
+        </w:rPr>
+        <w:t>MudGrid</w:t>
+      </w:r>
+      <w:proofErr w:type="spellEnd"/>
+      <w:r>
+        <w:t>&gt;</w:t>
       </w:r>
     </w:p>
     <w:p/>

</xml_diff>